<commit_message>
fix: HĐ Truc Vien 103 bỏ nệm, HĐ 201 Diệu thêm CCCD
</commit_message>
<xml_diff>
--- a/HĐ/103_Viên.docx
+++ b/HĐ/103_Viên.docx
@@ -1520,66 +1520,6 @@
       <w:r>
         <w:rPr>
           <w:spacing w:val="-8"/>
-          <w:sz w:val="24"/>
-          <w:szCs w:val="24"/>
-        </w:rPr>
-        <w:t xml:space="preserve"> </w:t>
-      </w:r>
-      <w:r>
-        <w:rPr>
-          <w:sz w:val="24"/>
-          <w:szCs w:val="24"/>
-        </w:rPr>
-        <w:t>x</w:t>
-      </w:r>
-      <w:r>
-        <w:rPr>
-          <w:spacing w:val="-8"/>
-          <w:sz w:val="24"/>
-          <w:szCs w:val="24"/>
-        </w:rPr>
-        <w:t xml:space="preserve"> </w:t>
-      </w:r>
-      <w:r>
-        <w:rPr>
-          <w:sz w:val="24"/>
-          <w:szCs w:val="24"/>
-        </w:rPr>
-        <w:t>2m;</w:t>
-      </w:r>
-      <w:r>
-        <w:rPr>
-          <w:spacing w:val="-8"/>
-          <w:sz w:val="24"/>
-          <w:szCs w:val="24"/>
-        </w:rPr>
-        <w:t xml:space="preserve"> </w:t>
-      </w:r>
-      <w:r>
-        <w:rPr>
-          <w:sz w:val="24"/>
-          <w:szCs w:val="24"/>
-        </w:rPr>
-        <w:t>nệm</w:t>
-      </w:r>
-      <w:r>
-        <w:rPr>
-          <w:spacing w:val="-6"/>
-          <w:sz w:val="24"/>
-          <w:szCs w:val="24"/>
-        </w:rPr>
-        <w:t xml:space="preserve"> </w:t>
-      </w:r>
-      <w:r>
-        <w:rPr>
-          <w:sz w:val="24"/>
-          <w:szCs w:val="24"/>
-        </w:rPr>
-        <w:t>1,6m</w:t>
-      </w:r>
-      <w:r>
-        <w:rPr>
-          <w:spacing w:val="-6"/>
           <w:sz w:val="24"/>
           <w:szCs w:val="24"/>
         </w:rPr>

</xml_diff>